<commit_message>
feat(export): add filtered export functionality with loading states
- Modify StudentController to handle 'all' limit parameter for exporting all filtered records
- Add getFilteredStudentsForExport function to fetch filtered data for export
- Implement loading states and disable buttons during export generation
- Update PDF, Excel, and Word export functions to use filtered data instead of allStudents
- Remove redundant modal close operations from export click handlers
</commit_message>
<xml_diff>
--- a/app/assets/SLIP.docx
+++ b/app/assets/SLIP.docx
@@ -9,25 +9,45 @@
           <w:szCs w:val="17"/>
         </w:rPr>
       </w:pPr>
+      <w:bookmarkStart w:id="0" w:name="_GoBack"/>
+      <w:bookmarkEnd w:id="0"/>
       <w:r>
         <w:rPr>
-          <w:rFonts w:ascii="Century Gothic" w:hAnsi="Century Gothic"/>
-          <w:sz w:val="17"/>
-          <w:szCs w:val="17"/>
+          <w:rFonts w:hint="default"/>
+          <w:lang w:val="en-PH"/>
         </w:rPr>
         <w:drawing>
           <wp:anchor distT="0" distB="0" distL="114300" distR="114300" simplePos="0" relativeHeight="251659264" behindDoc="1" locked="0" layoutInCell="1" allowOverlap="1">
             <wp:simplePos x="0" y="0"/>
-            <wp:positionH relativeFrom="margin">
-              <wp:posOffset>2111375</wp:posOffset>
+            <wp:positionH relativeFrom="column">
+              <wp:posOffset>2131695</wp:posOffset>
             </wp:positionH>
-            <wp:positionV relativeFrom="page">
-              <wp:posOffset>347345</wp:posOffset>
+            <wp:positionV relativeFrom="paragraph">
+              <wp:posOffset>-837565</wp:posOffset>
             </wp:positionV>
-            <wp:extent cx="5070475" cy="1076960"/>
-            <wp:effectExtent l="0" t="0" r="15875" b="8890"/>
-            <wp:wrapNone/>
-            <wp:docPr id="1298822657" name="Picture 1"/>
+            <wp:extent cx="5162550" cy="1044575"/>
+            <wp:effectExtent l="0" t="0" r="0" b="41910"/>
+            <wp:wrapThrough wrapText="bothSides">
+              <wp:wrapPolygon>
+                <wp:start x="18970" y="1970"/>
+                <wp:lineTo x="2710" y="2364"/>
+                <wp:lineTo x="717" y="3151"/>
+                <wp:lineTo x="717" y="9848"/>
+                <wp:lineTo x="1116" y="14575"/>
+                <wp:lineTo x="319" y="16939"/>
+                <wp:lineTo x="399" y="18514"/>
+                <wp:lineTo x="3188" y="20878"/>
+                <wp:lineTo x="3188" y="21272"/>
+                <wp:lineTo x="14267" y="21272"/>
+                <wp:lineTo x="18332" y="20878"/>
+                <wp:lineTo x="21281" y="18120"/>
+                <wp:lineTo x="21441" y="7091"/>
+                <wp:lineTo x="20404" y="2364"/>
+                <wp:lineTo x="19926" y="1970"/>
+                <wp:lineTo x="18970" y="1970"/>
+              </wp:wrapPolygon>
+            </wp:wrapThrough>
+            <wp:docPr id="3" name="Picture 3" descr="WPS Photo(1)"/>
             <wp:cNvGraphicFramePr>
               <a:graphicFrameLocks xmlns:a="http://schemas.openxmlformats.org/drawingml/2006/main" noChangeAspect="1"/>
             </wp:cNvGraphicFramePr>
@@ -35,19 +55,13 @@
               <a:graphicData uri="http://schemas.openxmlformats.org/drawingml/2006/picture">
                 <pic:pic xmlns:pic="http://schemas.openxmlformats.org/drawingml/2006/picture">
                   <pic:nvPicPr>
-                    <pic:cNvPr id="1298822657" name="Picture 1"/>
+                    <pic:cNvPr id="3" name="Picture 3" descr="WPS Photo(1)"/>
                     <pic:cNvPicPr>
                       <a:picLocks noChangeAspect="1"/>
                     </pic:cNvPicPr>
                   </pic:nvPicPr>
                   <pic:blipFill>
-                    <a:blip r:embed="rId6">
-                      <a:extLst>
-                        <a:ext uri="{28A0092B-C50C-407E-A947-70E740481C1C}">
-                          <a14:useLocalDpi xmlns:a14="http://schemas.microsoft.com/office/drawing/2010/main" val="0"/>
-                        </a:ext>
-                      </a:extLst>
-                    </a:blip>
+                    <a:blip r:embed="rId6"/>
                     <a:stretch>
                       <a:fillRect/>
                     </a:stretch>
@@ -55,7 +69,7 @@
                   <pic:spPr>
                     <a:xfrm>
                       <a:off x="0" y="0"/>
-                      <a:ext cx="5070475" cy="1076960"/>
+                      <a:ext cx="5162550" cy="1044575"/>
                     </a:xfrm>
                     <a:prstGeom prst="rect">
                       <a:avLst/>
@@ -163,47 +177,6 @@
           <w:lang w:val="en-PH"/>
         </w:rPr>
         <w:tab/>
-        <w:t/>
-      </w:r>
-      <w:r>
-        <w:rPr>
-          <w:rFonts w:hint="default" w:ascii="Century Gothic" w:hAnsi="Century Gothic"/>
-          <w:sz w:val="17"/>
-          <w:szCs w:val="17"/>
-          <w:lang w:val="en-PH"/>
-        </w:rPr>
-        <w:tab/>
-        <w:t/>
-      </w:r>
-      <w:r>
-        <w:rPr>
-          <w:rFonts w:hint="default" w:ascii="Century Gothic" w:hAnsi="Century Gothic"/>
-          <w:sz w:val="17"/>
-          <w:szCs w:val="17"/>
-          <w:lang w:val="en-PH"/>
-        </w:rPr>
-        <w:tab/>
-        <w:t/>
-      </w:r>
-      <w:r>
-        <w:rPr>
-          <w:rFonts w:hint="default" w:ascii="Century Gothic" w:hAnsi="Century Gothic"/>
-          <w:sz w:val="17"/>
-          <w:szCs w:val="17"/>
-          <w:lang w:val="en-PH"/>
-        </w:rPr>
-        <w:tab/>
-        <w:t/>
-      </w:r>
-      <w:r>
-        <w:rPr>
-          <w:rFonts w:hint="default" w:ascii="Century Gothic" w:hAnsi="Century Gothic"/>
-          <w:sz w:val="17"/>
-          <w:szCs w:val="17"/>
-          <w:lang w:val="en-PH"/>
-        </w:rPr>
-        <w:tab/>
-        <w:t/>
       </w:r>
       <w:r>
         <w:rPr>
@@ -216,14 +189,50 @@
       </w:r>
       <w:r>
         <w:rPr>
-          <w:rFonts w:ascii="Century Gothic" w:hAnsi="Century Gothic"/>
-          <w:sz w:val="17"/>
-          <w:szCs w:val="17"/>
+          <w:rFonts w:hint="default" w:ascii="Century Gothic" w:hAnsi="Century Gothic"/>
+          <w:sz w:val="17"/>
+          <w:szCs w:val="17"/>
+          <w:lang w:val="en-PH"/>
         </w:rPr>
         <w:tab/>
       </w:r>
       <w:r>
         <w:rPr>
+          <w:rFonts w:hint="default" w:ascii="Century Gothic" w:hAnsi="Century Gothic"/>
+          <w:sz w:val="17"/>
+          <w:szCs w:val="17"/>
+          <w:lang w:val="en-PH"/>
+        </w:rPr>
+        <w:tab/>
+      </w:r>
+      <w:r>
+        <w:rPr>
+          <w:rFonts w:hint="default" w:ascii="Century Gothic" w:hAnsi="Century Gothic"/>
+          <w:sz w:val="17"/>
+          <w:szCs w:val="17"/>
+          <w:lang w:val="en-PH"/>
+        </w:rPr>
+        <w:tab/>
+      </w:r>
+      <w:r>
+        <w:rPr>
+          <w:rFonts w:hint="default" w:ascii="Century Gothic" w:hAnsi="Century Gothic"/>
+          <w:sz w:val="17"/>
+          <w:szCs w:val="17"/>
+          <w:lang w:val="en-PH"/>
+        </w:rPr>
+        <w:tab/>
+      </w:r>
+      <w:r>
+        <w:rPr>
+          <w:rFonts w:ascii="Century Gothic" w:hAnsi="Century Gothic"/>
+          <w:sz w:val="17"/>
+          <w:szCs w:val="17"/>
+        </w:rPr>
+        <w:tab/>
+      </w:r>
+      <w:r>
+        <w:rPr>
           <w:rFonts w:ascii="Century Gothic" w:hAnsi="Century Gothic"/>
           <w:sz w:val="17"/>
           <w:szCs w:val="17"/>
@@ -241,8 +250,6 @@
           <w:szCs w:val="17"/>
         </w:rPr>
       </w:pPr>
-      <w:bookmarkStart w:id="0" w:name="_GoBack"/>
-      <w:bookmarkEnd w:id="0"/>
     </w:p>
     <w:p>
       <w:pPr>
@@ -1934,7 +1941,7 @@
     <w:lsdException w:qFormat="1" w:unhideWhenUsed="0" w:uiPriority="0" w:semiHidden="0" w:name="Title"/>
     <w:lsdException w:unhideWhenUsed="0" w:uiPriority="0" w:semiHidden="0" w:name="Closing"/>
     <w:lsdException w:unhideWhenUsed="0" w:uiPriority="0" w:semiHidden="0" w:name="Signature"/>
-    <w:lsdException w:unhideWhenUsed="0" w:uiPriority="0" w:name="Default Paragraph Font"/>
+    <w:lsdException w:qFormat="1" w:unhideWhenUsed="0" w:uiPriority="0" w:name="Default Paragraph Font"/>
     <w:lsdException w:unhideWhenUsed="0" w:uiPriority="0" w:semiHidden="0" w:name="Body Text"/>
     <w:lsdException w:unhideWhenUsed="0" w:uiPriority="0" w:semiHidden="0" w:name="Body Text Indent"/>
     <w:lsdException w:unhideWhenUsed="0" w:uiPriority="0" w:semiHidden="0" w:name="List Continue"/>
@@ -1972,7 +1979,7 @@
     <w:lsdException w:unhideWhenUsed="0" w:uiPriority="0" w:semiHidden="0" w:name="HTML Sample"/>
     <w:lsdException w:unhideWhenUsed="0" w:uiPriority="0" w:semiHidden="0" w:name="HTML Typewriter"/>
     <w:lsdException w:unhideWhenUsed="0" w:uiPriority="0" w:semiHidden="0" w:name="HTML Variable"/>
-    <w:lsdException w:unhideWhenUsed="0" w:uiPriority="0" w:name="Normal Table"/>
+    <w:lsdException w:qFormat="1" w:unhideWhenUsed="0" w:uiPriority="0" w:name="Normal Table"/>
     <w:lsdException w:unhideWhenUsed="0" w:uiPriority="0" w:semiHidden="0" w:name="annotation subject"/>
     <w:lsdException w:unhideWhenUsed="0" w:uiPriority="0" w:semiHidden="0" w:name="Table Simple 1"/>
     <w:lsdException w:unhideWhenUsed="0" w:uiPriority="0" w:semiHidden="0" w:name="Table Simple 2"/>
@@ -2138,11 +2145,13 @@
   <w:style w:type="character" w:default="1" w:styleId="2">
     <w:name w:val="Default Paragraph Font"/>
     <w:semiHidden/>
+    <w:qFormat/>
     <w:uiPriority w:val="0"/>
   </w:style>
   <w:style w:type="table" w:default="1" w:styleId="3">
     <w:name w:val="Normal Table"/>
     <w:semiHidden/>
+    <w:qFormat/>
     <w:uiPriority w:val="0"/>
     <w:tblPr>
       <w:tblCellMar>

</xml_diff>

<commit_message>
docs: update SLIP.docx template formatting and content
- Remove temporary file reference from tracking
- Adjust spacing and alignment for better readability
- Add administrator name to both signature sections
- Standardize formatting throughout the document
</commit_message>
<xml_diff>
--- a/app/assets/SLIP.docx
+++ b/app/assets/SLIP.docx
@@ -4,12 +4,12 @@
   <w:body>
     <w:p>
       <w:pPr>
-        <w:rPr>
-          <w:rFonts w:ascii="Century Gothic" w:hAnsi="Century Gothic"/>
-          <w:b/>
-          <w:bCs/>
-          <w:sz w:val="15"/>
-          <w:szCs w:val="15"/>
+        <w:ind w:firstLine="2475" w:firstLineChars="1650"/>
+        <w:rPr>
+          <w:rFonts w:hint="default" w:ascii="Century Gothic" w:hAnsi="Century Gothic"/>
+          <w:sz w:val="15"/>
+          <w:szCs w:val="15"/>
+          <w:lang w:val="en-US"/>
         </w:rPr>
       </w:pPr>
       <w:r>
@@ -23,31 +23,28 @@
           <wp:anchor distT="0" distB="0" distL="114300" distR="114300" simplePos="0" relativeHeight="251659264" behindDoc="1" locked="0" layoutInCell="1" allowOverlap="1">
             <wp:simplePos x="0" y="0"/>
             <wp:positionH relativeFrom="column">
-              <wp:posOffset>15875</wp:posOffset>
+              <wp:posOffset>278130</wp:posOffset>
             </wp:positionH>
             <wp:positionV relativeFrom="paragraph">
-              <wp:posOffset>-767080</wp:posOffset>
+              <wp:posOffset>-758825</wp:posOffset>
             </wp:positionV>
-            <wp:extent cx="4083050" cy="826135"/>
-            <wp:effectExtent l="0" t="0" r="12700" b="12700"/>
+            <wp:extent cx="3488690" cy="706120"/>
+            <wp:effectExtent l="0" t="0" r="35560" b="56515"/>
             <wp:wrapThrough wrapText="bothSides">
               <wp:wrapPolygon>
-                <wp:start x="15016" y="1992"/>
-                <wp:lineTo x="2721" y="1992"/>
-                <wp:lineTo x="605" y="2988"/>
-                <wp:lineTo x="605" y="9962"/>
-                <wp:lineTo x="202" y="17931"/>
-                <wp:lineTo x="202" y="18429"/>
-                <wp:lineTo x="2822" y="20919"/>
-                <wp:lineTo x="3124" y="20919"/>
-                <wp:lineTo x="14210" y="20919"/>
-                <wp:lineTo x="15923" y="20919"/>
-                <wp:lineTo x="20659" y="18927"/>
-                <wp:lineTo x="21466" y="11456"/>
-                <wp:lineTo x="21466" y="7969"/>
-                <wp:lineTo x="20659" y="3487"/>
-                <wp:lineTo x="20055" y="1992"/>
-                <wp:lineTo x="15016" y="1992"/>
+                <wp:start x="18871" y="1748"/>
+                <wp:lineTo x="2713" y="1748"/>
+                <wp:lineTo x="590" y="2914"/>
+                <wp:lineTo x="354" y="18065"/>
+                <wp:lineTo x="944" y="20396"/>
+                <wp:lineTo x="3067" y="20978"/>
+                <wp:lineTo x="14272" y="20978"/>
+                <wp:lineTo x="19107" y="20396"/>
+                <wp:lineTo x="21466" y="17482"/>
+                <wp:lineTo x="21466" y="7576"/>
+                <wp:lineTo x="20641" y="2914"/>
+                <wp:lineTo x="19933" y="1748"/>
+                <wp:lineTo x="18871" y="1748"/>
               </wp:wrapPolygon>
             </wp:wrapThrough>
             <wp:docPr id="3" name="Picture 3" descr="WPS Photo(1)"/>
@@ -72,7 +69,7 @@
                   <pic:spPr>
                     <a:xfrm>
                       <a:off x="0" y="0"/>
-                      <a:ext cx="4083050" cy="826135"/>
+                      <a:ext cx="3488690" cy="706120"/>
                     </a:xfrm>
                     <a:prstGeom prst="rect">
                       <a:avLst/>
@@ -84,12 +81,7 @@
           </wp:anchor>
         </w:drawing>
       </w:r>
-    </w:p>
-    <w:p>
-      <w:pPr>
-        <w:pStyle w:val="6"/>
-        <w:ind w:left="1440" w:leftChars="0" w:firstLine="720" w:firstLineChars="0"/>
-        <w:jc w:val="both"/>
+      <w:r>
         <w:rPr>
           <w:rFonts w:ascii="Century Gothic" w:hAnsi="Century Gothic"/>
           <w:b/>
@@ -97,73 +89,43 @@
           <w:sz w:val="15"/>
           <w:szCs w:val="15"/>
         </w:rPr>
-      </w:pPr>
-      <w:r>
+        <w:t>ENTRANCE SLIP</w:t>
+      </w:r>
+    </w:p>
+    <w:p>
+      <w:pPr>
+        <w:pStyle w:val="6"/>
         <w:rPr>
           <w:rFonts w:ascii="Century Gothic" w:hAnsi="Century Gothic"/>
-          <w:b/>
-          <w:bCs/>
-          <w:sz w:val="15"/>
-          <w:szCs w:val="15"/>
-        </w:rPr>
-        <w:t>ENTRANCE SLIP</w:t>
-      </w:r>
-    </w:p>
-    <w:p>
-      <w:pPr>
-        <w:pStyle w:val="6"/>
+          <w:sz w:val="15"/>
+          <w:szCs w:val="15"/>
+        </w:rPr>
+      </w:pPr>
+      <w:r>
         <w:rPr>
           <w:rFonts w:ascii="Century Gothic" w:hAnsi="Century Gothic"/>
           <w:sz w:val="15"/>
           <w:szCs w:val="15"/>
         </w:rPr>
-      </w:pPr>
-    </w:p>
-    <w:p>
-      <w:pPr>
-        <w:pStyle w:val="6"/>
+        <w:t xml:space="preserve">ID Number: </w:t>
+      </w:r>
+      <w:r>
+        <w:rPr>
+          <w:rFonts w:hint="default" w:ascii="Century Gothic" w:hAnsi="Century Gothic"/>
+          <w:sz w:val="15"/>
+          <w:szCs w:val="15"/>
+          <w:lang w:val="en-PH"/>
+        </w:rPr>
+        <w:t>_________________________</w:t>
+      </w:r>
+      <w:r>
         <w:rPr>
           <w:rFonts w:ascii="Century Gothic" w:hAnsi="Century Gothic"/>
           <w:sz w:val="15"/>
           <w:szCs w:val="15"/>
         </w:rPr>
-      </w:pPr>
-      <w:r>
-        <w:rPr>
-          <w:rFonts w:ascii="Century Gothic" w:hAnsi="Century Gothic"/>
-          <w:sz w:val="15"/>
-          <w:szCs w:val="15"/>
-        </w:rPr>
-        <w:t xml:space="preserve">ID Number: </w:t>
-      </w:r>
-      <w:r>
-        <w:rPr>
-          <w:rFonts w:hint="default" w:ascii="Century Gothic" w:hAnsi="Century Gothic"/>
-          <w:sz w:val="15"/>
-          <w:szCs w:val="15"/>
-          <w:lang w:val="en-PH"/>
-        </w:rPr>
-        <w:t>_________________________</w:t>
-      </w:r>
-      <w:r>
-        <w:rPr>
-          <w:rFonts w:ascii="Century Gothic" w:hAnsi="Century Gothic"/>
-          <w:sz w:val="15"/>
-          <w:szCs w:val="15"/>
-        </w:rPr>
         <w:t>Course and Year:________________</w:t>
       </w:r>
-    </w:p>
-    <w:p>
-      <w:pPr>
-        <w:pStyle w:val="6"/>
-        <w:ind w:left="720" w:leftChars="0" w:firstLine="720" w:firstLineChars="0"/>
-        <w:rPr>
-          <w:rFonts w:ascii="Century Gothic" w:hAnsi="Century Gothic"/>
-          <w:sz w:val="15"/>
-          <w:szCs w:val="15"/>
-        </w:rPr>
-      </w:pPr>
     </w:p>
     <w:p>
       <w:pPr>
@@ -184,18 +146,6 @@
         </w:rPr>
         <w:t>Name: ______________________________________</w:t>
       </w:r>
-    </w:p>
-    <w:p>
-      <w:pPr>
-        <w:pStyle w:val="6"/>
-        <w:rPr>
-          <w:rFonts w:cstheme="minorHAnsi"/>
-          <w:b/>
-          <w:bCs/>
-          <w:sz w:val="15"/>
-          <w:szCs w:val="15"/>
-        </w:rPr>
-      </w:pPr>
     </w:p>
     <w:tbl>
       <w:tblPr>
@@ -213,12 +163,12 @@
         </w:tblCellMar>
       </w:tblPr>
       <w:tblGrid>
-        <w:gridCol w:w="1822"/>
-        <w:gridCol w:w="929"/>
-        <w:gridCol w:w="929"/>
-        <w:gridCol w:w="1054"/>
-        <w:gridCol w:w="1147"/>
-        <w:gridCol w:w="1098"/>
+        <w:gridCol w:w="1824"/>
+        <w:gridCol w:w="943"/>
+        <w:gridCol w:w="943"/>
+        <w:gridCol w:w="1035"/>
+        <w:gridCol w:w="1137"/>
+        <w:gridCol w:w="1097"/>
       </w:tblGrid>
       <w:tr>
         <w:tblPrEx>
@@ -1227,6 +1177,7 @@
     <w:p>
       <w:pPr>
         <w:pStyle w:val="6"/>
+        <w:ind w:firstLine="720" w:firstLineChars="0"/>
         <w:rPr>
           <w:rFonts w:cstheme="minorHAnsi"/>
           <w:b/>
@@ -1324,7 +1275,24 @@
           <w:sz w:val="15"/>
           <w:szCs w:val="15"/>
         </w:rPr>
-        <w:t>Further violations beyond this limit will result in appropriate disciplinary actions.</w:t>
+        <w:t>Further</w:t>
+      </w:r>
+      <w:r>
+        <w:rPr>
+          <w:rFonts w:hint="default" w:cstheme="minorHAnsi"/>
+          <w:sz w:val="15"/>
+          <w:szCs w:val="15"/>
+          <w:lang w:val="en-US"/>
+        </w:rPr>
+        <w:t xml:space="preserve"> </w:t>
+      </w:r>
+      <w:r>
+        <w:rPr>
+          <w:rFonts w:cstheme="minorHAnsi"/>
+          <w:sz w:val="15"/>
+          <w:szCs w:val="15"/>
+        </w:rPr>
+        <w:t>violations beyond this limit will result in appropriate disciplinary actions.</w:t>
       </w:r>
     </w:p>
     <w:p>
@@ -1332,9 +1300,9 @@
         <w:pStyle w:val="6"/>
         <w:numPr>
           <w:ilvl w:val="0"/>
-          <w:numId w:val="1"/>
+          <w:numId w:val="0"/>
         </w:numPr>
-        <w:ind w:left="420" w:leftChars="0" w:hanging="420" w:firstLineChars="0"/>
+        <w:ind w:leftChars="0"/>
         <w:rPr>
           <w:rFonts w:cstheme="minorHAnsi"/>
           <w:sz w:val="15"/>
@@ -1398,8 +1366,80 @@
     </w:p>
     <w:p>
       <w:pPr>
+        <w:pStyle w:val="6"/>
+        <w:numPr>
+          <w:ilvl w:val="0"/>
+          <w:numId w:val="0"/>
+        </w:numPr>
+        <w:tabs>
+          <w:tab w:val="left" w:pos="420"/>
+        </w:tabs>
+        <w:spacing w:after="0" w:line="240" w:lineRule="auto"/>
+        <w:rPr>
+          <w:rFonts w:cstheme="minorHAnsi"/>
+          <w:sz w:val="15"/>
+          <w:szCs w:val="15"/>
+        </w:rPr>
+      </w:pPr>
+    </w:p>
+    <w:p>
+      <w:pPr>
+        <w:pStyle w:val="6"/>
+        <w:numPr>
+          <w:ilvl w:val="0"/>
+          <w:numId w:val="0"/>
+        </w:numPr>
+        <w:tabs>
+          <w:tab w:val="left" w:pos="420"/>
+        </w:tabs>
+        <w:spacing w:after="0" w:line="240" w:lineRule="auto"/>
+        <w:rPr>
+          <w:rFonts w:cstheme="minorHAnsi"/>
+          <w:sz w:val="15"/>
+          <w:szCs w:val="15"/>
+        </w:rPr>
+      </w:pPr>
+    </w:p>
+    <w:p>
+      <w:pPr>
+        <w:pStyle w:val="6"/>
+        <w:numPr>
+          <w:ilvl w:val="0"/>
+          <w:numId w:val="0"/>
+        </w:numPr>
+        <w:tabs>
+          <w:tab w:val="left" w:pos="420"/>
+        </w:tabs>
+        <w:spacing w:after="0" w:line="240" w:lineRule="auto"/>
+        <w:rPr>
+          <w:rFonts w:cstheme="minorHAnsi"/>
+          <w:sz w:val="15"/>
+          <w:szCs w:val="15"/>
+        </w:rPr>
+      </w:pPr>
+    </w:p>
+    <w:p>
+      <w:pPr>
+        <w:pStyle w:val="6"/>
+        <w:numPr>
+          <w:ilvl w:val="0"/>
+          <w:numId w:val="0"/>
+        </w:numPr>
+        <w:tabs>
+          <w:tab w:val="left" w:pos="420"/>
+        </w:tabs>
+        <w:spacing w:after="0" w:line="240" w:lineRule="auto"/>
+        <w:rPr>
+          <w:rFonts w:cstheme="minorHAnsi"/>
+          <w:sz w:val="15"/>
+          <w:szCs w:val="15"/>
+        </w:rPr>
+      </w:pPr>
+    </w:p>
+    <w:p>
+      <w:pPr>
         <w:spacing w:line="240" w:lineRule="auto"/>
-        <w:ind w:left="3600" w:leftChars="0" w:firstLine="720" w:firstLineChars="0"/>
+        <w:ind w:firstLine="4727" w:firstLineChars="3150"/>
         <w:jc w:val="both"/>
         <w:rPr>
           <w:rFonts w:hint="default"/>
@@ -1408,11 +1448,13 @@
           <w:sz w:val="15"/>
           <w:szCs w:val="15"/>
           <w:u w:val="none"/>
-          <w:lang w:val="en-PH"/>
-        </w:rPr>
-      </w:pPr>
-      <w:r>
-        <w:rPr>
+          <w:lang w:val="en-US"/>
+        </w:rPr>
+      </w:pPr>
+      <w:r>
+        <w:rPr>
+          <w:b/>
+          <w:bCs/>
           <w:sz w:val="15"/>
         </w:rPr>
         <mc:AlternateContent>
@@ -1421,7 +1463,7 @@
               <wp:anchor distT="0" distB="0" distL="114300" distR="114300" simplePos="0" relativeHeight="251662336" behindDoc="0" locked="0" layoutInCell="1" allowOverlap="1">
                 <wp:simplePos x="0" y="0"/>
                 <wp:positionH relativeFrom="column">
-                  <wp:posOffset>2562860</wp:posOffset>
+                  <wp:posOffset>2713990</wp:posOffset>
                 </wp:positionH>
                 <wp:positionV relativeFrom="paragraph">
                   <wp:posOffset>152400</wp:posOffset>
@@ -1429,7 +1471,7 @@
                 <wp:extent cx="1447165" cy="9525"/>
                 <wp:effectExtent l="0" t="0" r="0" b="0"/>
                 <wp:wrapNone/>
-                <wp:docPr id="6" name="Straight Connector 6"/>
+                <wp:docPr id="4" name="Straight Connector 4"/>
                 <wp:cNvGraphicFramePr/>
                 <a:graphic xmlns:a="http://schemas.openxmlformats.org/drawingml/2006/main">
                   <a:graphicData uri="http://schemas.microsoft.com/office/word/2010/wordprocessingShape">
@@ -1472,7 +1514,7 @@
           </mc:Choice>
           <mc:Fallback>
             <w:pict>
-              <v:line id="_x0000_s1026" o:spid="_x0000_s1026" o:spt="20" style="position:absolute;left:0pt;margin-left:201.8pt;margin-top:12pt;height:0.75pt;width:113.95pt;z-index:251662336;mso-width-relative:page;mso-height-relative:page;" filled="f" stroked="t" coordsize="21600,21600" o:gfxdata="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">
+              <v:line id="_x0000_s1026" o:spid="_x0000_s1026" o:spt="20" style="position:absolute;left:0pt;margin-left:213.7pt;margin-top:12pt;height:0.75pt;width:113.95pt;z-index:251662336;mso-width-relative:page;mso-height-relative:page;" filled="f" stroked="t" coordsize="21600,21600" o:gfxdata="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">
                 <v:fill on="f" focussize="0,0"/>
                 <v:stroke weight="1pt" color="#000000 [3213]" miterlimit="8" joinstyle="miter"/>
                 <v:imagedata o:title=""/>
@@ -1488,28 +1530,24 @@
           <w:b/>
           <w:bCs/>
           <w:sz w:val="15"/>
-          <w:szCs w:val="15"/>
-          <w:u w:val="none"/>
-          <w:lang w:val="en-PH"/>
-        </w:rPr>
-        <w:t>Osas Director/Administrator</w:t>
+          <w:lang w:val="en-US"/>
+        </w:rPr>
+        <w:t>CEDRICK H. ALMAREZ</w:t>
       </w:r>
     </w:p>
     <w:p>
       <w:pPr>
         <w:spacing w:line="240" w:lineRule="auto"/>
-        <w:ind w:left="3600" w:leftChars="0" w:firstLine="720" w:firstLineChars="0"/>
+        <w:ind w:firstLine="4427" w:firstLineChars="2950"/>
         <w:jc w:val="both"/>
         <w:rPr>
           <w:rFonts w:hint="default"/>
           <w:b/>
           <w:bCs/>
-          <w:i/>
-          <w:iCs/>
           <w:sz w:val="15"/>
           <w:szCs w:val="15"/>
           <w:u w:val="none"/>
-          <w:lang w:val="en-PH"/>
+          <w:lang w:val="en-US"/>
         </w:rPr>
       </w:pPr>
       <w:r>
@@ -1517,14 +1555,24 @@
           <w:rFonts w:hint="default"/>
           <w:b/>
           <w:bCs/>
-          <w:i/>
-          <w:iCs/>
           <w:sz w:val="15"/>
           <w:szCs w:val="15"/>
           <w:u w:val="none"/>
           <w:lang w:val="en-PH"/>
         </w:rPr>
-        <w:t>Signature Over Printed Name</w:t>
+        <w:t>Osas Director/Administrato</w:t>
+      </w:r>
+      <w:r>
+        <w:rPr>
+          <w:rFonts w:hint="default"/>
+          <w:b/>
+          <w:bCs/>
+          <w:sz w:val="15"/>
+          <w:szCs w:val="15"/>
+          <w:u w:val="none"/>
+          <w:lang w:val="en-US"/>
+        </w:rPr>
+        <w:t>r</w:t>
       </w:r>
     </w:p>
     <w:p>
@@ -1538,6 +1586,7 @@
           <w:tab w:val="left" w:pos="420"/>
         </w:tabs>
         <w:spacing w:after="0" w:line="240" w:lineRule="auto"/>
+        <w:jc w:val="both"/>
         <w:rPr>
           <w:rFonts w:cstheme="minorHAnsi"/>
           <w:sz w:val="15"/>
@@ -1555,33 +1604,14 @@
           <wp:anchor distT="0" distB="0" distL="114300" distR="114300" simplePos="0" relativeHeight="251660288" behindDoc="1" locked="0" layoutInCell="1" allowOverlap="1">
             <wp:simplePos x="0" y="0"/>
             <wp:positionH relativeFrom="column">
-              <wp:posOffset>188595</wp:posOffset>
+              <wp:posOffset>655320</wp:posOffset>
             </wp:positionH>
             <wp:positionV relativeFrom="paragraph">
-              <wp:posOffset>-767080</wp:posOffset>
+              <wp:posOffset>-723900</wp:posOffset>
             </wp:positionV>
-            <wp:extent cx="4083050" cy="826135"/>
-            <wp:effectExtent l="0" t="0" r="12700" b="12700"/>
-            <wp:wrapThrough wrapText="bothSides">
-              <wp:wrapPolygon>
-                <wp:start x="15016" y="1992"/>
-                <wp:lineTo x="2721" y="1992"/>
-                <wp:lineTo x="605" y="2988"/>
-                <wp:lineTo x="605" y="9962"/>
-                <wp:lineTo x="202" y="17931"/>
-                <wp:lineTo x="202" y="18429"/>
-                <wp:lineTo x="2822" y="20919"/>
-                <wp:lineTo x="3124" y="20919"/>
-                <wp:lineTo x="14210" y="20919"/>
-                <wp:lineTo x="15923" y="20919"/>
-                <wp:lineTo x="20659" y="18927"/>
-                <wp:lineTo x="21466" y="11456"/>
-                <wp:lineTo x="21466" y="7969"/>
-                <wp:lineTo x="20659" y="3487"/>
-                <wp:lineTo x="20055" y="1992"/>
-                <wp:lineTo x="15016" y="1992"/>
-              </wp:wrapPolygon>
-            </wp:wrapThrough>
+            <wp:extent cx="3253740" cy="658495"/>
+            <wp:effectExtent l="0" t="0" r="41910" b="46990"/>
+            <wp:wrapNone/>
             <wp:docPr id="2" name="Picture 2" descr="WPS Photo(1)"/>
             <wp:cNvGraphicFramePr>
               <a:graphicFrameLocks xmlns:a="http://schemas.openxmlformats.org/drawingml/2006/main" noChangeAspect="1"/>
@@ -1604,7 +1634,7 @@
                   <pic:spPr>
                     <a:xfrm>
                       <a:off x="0" y="0"/>
-                      <a:ext cx="4083050" cy="826135"/>
+                      <a:ext cx="3253740" cy="658495"/>
                     </a:xfrm>
                     <a:prstGeom prst="rect">
                       <a:avLst/>
@@ -1616,6 +1646,25 @@
           </wp:anchor>
         </w:drawing>
       </w:r>
+      <w:r>
+        <w:rPr>
+          <w:rFonts w:hint="default"/>
+          <w:sz w:val="15"/>
+          <w:szCs w:val="15"/>
+          <w:lang w:val="en-US"/>
+        </w:rPr>
+        <w:t xml:space="preserve">                                                                                                </w:t>
+      </w:r>
+      <w:r>
+        <w:rPr>
+          <w:rFonts w:ascii="Century Gothic" w:hAnsi="Century Gothic"/>
+          <w:b/>
+          <w:bCs/>
+          <w:sz w:val="15"/>
+          <w:szCs w:val="15"/>
+        </w:rPr>
+        <w:t>ENTRANCE SLIP</w:t>
+      </w:r>
     </w:p>
     <w:p>
       <w:pPr>
@@ -1638,49 +1687,38 @@
     <w:p>
       <w:pPr>
         <w:pStyle w:val="6"/>
-        <w:numPr>
-          <w:ilvl w:val="0"/>
-          <w:numId w:val="0"/>
-        </w:numPr>
-        <w:tabs>
-          <w:tab w:val="left" w:pos="420"/>
-        </w:tabs>
-        <w:spacing w:after="0" w:line="240" w:lineRule="auto"/>
-        <w:jc w:val="center"/>
-        <w:rPr>
-          <w:rFonts w:cstheme="minorHAnsi"/>
-          <w:sz w:val="15"/>
-          <w:szCs w:val="15"/>
-        </w:rPr>
-      </w:pPr>
-      <w:r>
+        <w:ind w:firstLine="375" w:firstLineChars="250"/>
         <w:rPr>
           <w:rFonts w:ascii="Century Gothic" w:hAnsi="Century Gothic"/>
-          <w:b/>
-          <w:bCs/>
-          <w:sz w:val="15"/>
-          <w:szCs w:val="15"/>
-        </w:rPr>
-        <w:t>ENTRANCE SLIP</w:t>
-      </w:r>
-    </w:p>
-    <w:p>
-      <w:pPr>
-        <w:pStyle w:val="6"/>
-        <w:numPr>
-          <w:ilvl w:val="0"/>
-          <w:numId w:val="0"/>
-        </w:numPr>
-        <w:tabs>
-          <w:tab w:val="left" w:pos="420"/>
-        </w:tabs>
-        <w:spacing w:after="0" w:line="240" w:lineRule="auto"/>
-        <w:rPr>
-          <w:rFonts w:cstheme="minorHAnsi"/>
-          <w:sz w:val="15"/>
-          <w:szCs w:val="15"/>
-        </w:rPr>
-      </w:pPr>
+          <w:sz w:val="15"/>
+          <w:szCs w:val="15"/>
+        </w:rPr>
+      </w:pPr>
+      <w:r>
+        <w:rPr>
+          <w:rFonts w:ascii="Century Gothic" w:hAnsi="Century Gothic"/>
+          <w:sz w:val="15"/>
+          <w:szCs w:val="15"/>
+        </w:rPr>
+        <w:t xml:space="preserve">ID Number: </w:t>
+      </w:r>
+      <w:r>
+        <w:rPr>
+          <w:rFonts w:hint="default" w:ascii="Century Gothic" w:hAnsi="Century Gothic"/>
+          <w:sz w:val="15"/>
+          <w:szCs w:val="15"/>
+          <w:lang w:val="en-PH"/>
+        </w:rPr>
+        <w:t>_________________________</w:t>
+      </w:r>
+      <w:r>
+        <w:rPr>
+          <w:rFonts w:ascii="Century Gothic" w:hAnsi="Century Gothic"/>
+          <w:sz w:val="15"/>
+          <w:szCs w:val="15"/>
+        </w:rPr>
+        <w:t>Course and Year:________________</w:t>
+      </w:r>
     </w:p>
     <w:p>
       <w:pPr>
@@ -1698,66 +1736,8 @@
           <w:sz w:val="15"/>
           <w:szCs w:val="15"/>
         </w:rPr>
-        <w:t xml:space="preserve">ID Number: </w:t>
-      </w:r>
-      <w:r>
-        <w:rPr>
-          <w:rFonts w:hint="default" w:ascii="Century Gothic" w:hAnsi="Century Gothic"/>
-          <w:sz w:val="15"/>
-          <w:szCs w:val="15"/>
-          <w:lang w:val="en-PH"/>
-        </w:rPr>
-        <w:t>_________________________</w:t>
-      </w:r>
-      <w:r>
-        <w:rPr>
-          <w:rFonts w:ascii="Century Gothic" w:hAnsi="Century Gothic"/>
-          <w:sz w:val="15"/>
-          <w:szCs w:val="15"/>
-        </w:rPr>
-        <w:t>Course and Year:________________</w:t>
-      </w:r>
-    </w:p>
-    <w:p>
-      <w:pPr>
-        <w:pStyle w:val="6"/>
-        <w:ind w:left="720" w:leftChars="0" w:firstLine="720" w:firstLineChars="0"/>
-        <w:rPr>
-          <w:rFonts w:ascii="Century Gothic" w:hAnsi="Century Gothic"/>
-          <w:sz w:val="15"/>
-          <w:szCs w:val="15"/>
-        </w:rPr>
-      </w:pPr>
-    </w:p>
-    <w:p>
-      <w:pPr>
-        <w:pStyle w:val="6"/>
-        <w:ind w:firstLine="375" w:firstLineChars="250"/>
-        <w:rPr>
-          <w:rFonts w:ascii="Century Gothic" w:hAnsi="Century Gothic"/>
-          <w:sz w:val="15"/>
-          <w:szCs w:val="15"/>
-        </w:rPr>
-      </w:pPr>
-      <w:r>
-        <w:rPr>
-          <w:rFonts w:ascii="Century Gothic" w:hAnsi="Century Gothic"/>
-          <w:sz w:val="15"/>
-          <w:szCs w:val="15"/>
-        </w:rPr>
         <w:t>Name: ______________________________________</w:t>
       </w:r>
-    </w:p>
-    <w:p>
-      <w:pPr>
-        <w:pStyle w:val="6"/>
-        <w:ind w:firstLine="375" w:firstLineChars="250"/>
-        <w:rPr>
-          <w:rFonts w:ascii="Century Gothic" w:hAnsi="Century Gothic"/>
-          <w:sz w:val="15"/>
-          <w:szCs w:val="15"/>
-        </w:rPr>
-      </w:pPr>
     </w:p>
     <w:tbl>
       <w:tblPr>
@@ -1775,12 +1755,12 @@
         </w:tblCellMar>
       </w:tblPr>
       <w:tblGrid>
-        <w:gridCol w:w="1822"/>
-        <w:gridCol w:w="929"/>
-        <w:gridCol w:w="929"/>
-        <w:gridCol w:w="1054"/>
-        <w:gridCol w:w="1147"/>
-        <w:gridCol w:w="1098"/>
+        <w:gridCol w:w="1824"/>
+        <w:gridCol w:w="943"/>
+        <w:gridCol w:w="943"/>
+        <w:gridCol w:w="1035"/>
+        <w:gridCol w:w="1137"/>
+        <w:gridCol w:w="1097"/>
       </w:tblGrid>
       <w:tr>
         <w:tblPrEx>
@@ -1792,7 +1772,7 @@
           </w:tblCellMar>
         </w:tblPrEx>
         <w:trPr>
-          <w:trHeight w:val="660" w:hRule="atLeast"/>
+          <w:trHeight w:val="639" w:hRule="atLeast"/>
         </w:trPr>
         <w:tc>
           <w:tcPr>
@@ -2553,7 +2533,7 @@
           </w:tblCellMar>
         </w:tblPrEx>
         <w:trPr>
-          <w:trHeight w:val="744" w:hRule="atLeast"/>
+          <w:trHeight w:val="588" w:hRule="atLeast"/>
         </w:trPr>
         <w:tc>
           <w:tcPr>
@@ -2898,12 +2878,29 @@
           <w:szCs w:val="15"/>
         </w:rPr>
       </w:pPr>
+    </w:p>
+    <w:p>
+      <w:pPr>
+        <w:jc w:val="both"/>
+        <w:rPr>
+          <w:sz w:val="15"/>
+          <w:szCs w:val="15"/>
+        </w:rPr>
+      </w:pPr>
+    </w:p>
+    <w:p>
+      <w:pPr>
+        <w:jc w:val="both"/>
+        <w:rPr>
+          <w:sz w:val="15"/>
+          <w:szCs w:val="15"/>
+        </w:rPr>
+      </w:pPr>
       <w:bookmarkStart w:id="0" w:name="_GoBack"/>
       <w:bookmarkEnd w:id="0"/>
     </w:p>
     <w:p>
       <w:pPr>
-        <w:ind w:left="5040" w:leftChars="0" w:firstLine="720" w:firstLineChars="0"/>
         <w:jc w:val="both"/>
         <w:rPr>
           <w:sz w:val="15"/>
@@ -2914,7 +2911,7 @@
     <w:p>
       <w:pPr>
         <w:spacing w:line="240" w:lineRule="auto"/>
-        <w:ind w:left="3600" w:leftChars="0" w:firstLine="1015" w:firstLineChars="677"/>
+        <w:ind w:firstLine="4727" w:firstLineChars="3150"/>
         <w:jc w:val="both"/>
         <w:rPr>
           <w:rFonts w:hint="default"/>
@@ -2923,11 +2920,13 @@
           <w:sz w:val="15"/>
           <w:szCs w:val="15"/>
           <w:u w:val="none"/>
-          <w:lang w:val="en-PH"/>
-        </w:rPr>
-      </w:pPr>
-      <w:r>
-        <w:rPr>
+          <w:lang w:val="en-US"/>
+        </w:rPr>
+      </w:pPr>
+      <w:r>
+        <w:rPr>
+          <w:b/>
+          <w:bCs/>
           <w:sz w:val="15"/>
         </w:rPr>
         <mc:AlternateContent>
@@ -3003,17 +3002,55 @@
           <w:b/>
           <w:bCs/>
           <w:sz w:val="15"/>
+          <w:lang w:val="en-US"/>
+        </w:rPr>
+        <w:t>CEDRICK H. ALMAREZ</w:t>
+      </w:r>
+    </w:p>
+    <w:p>
+      <w:pPr>
+        <w:spacing w:line="240" w:lineRule="auto"/>
+        <w:ind w:firstLine="4427" w:firstLineChars="2950"/>
+        <w:jc w:val="both"/>
+        <w:rPr>
+          <w:rFonts w:hint="default"/>
+          <w:b/>
+          <w:bCs/>
+          <w:sz w:val="15"/>
+          <w:szCs w:val="15"/>
+          <w:u w:val="none"/>
+          <w:lang w:val="en-US"/>
+        </w:rPr>
+      </w:pPr>
+      <w:r>
+        <w:rPr>
+          <w:rFonts w:hint="default"/>
+          <w:b/>
+          <w:bCs/>
+          <w:sz w:val="15"/>
           <w:szCs w:val="15"/>
           <w:u w:val="none"/>
           <w:lang w:val="en-PH"/>
         </w:rPr>
-        <w:t>Osas Director/Administrator</w:t>
+        <w:t>Osas Director/Administrato</w:t>
+      </w:r>
+      <w:r>
+        <w:rPr>
+          <w:rFonts w:hint="default"/>
+          <w:b/>
+          <w:bCs/>
+          <w:sz w:val="15"/>
+          <w:szCs w:val="15"/>
+          <w:u w:val="none"/>
+          <w:lang w:val="en-US"/>
+        </w:rPr>
+        <w:t>r</w:t>
       </w:r>
     </w:p>
     <w:p>
       <w:pPr>
         <w:spacing w:line="240" w:lineRule="auto"/>
-        <w:ind w:left="3600" w:leftChars="0" w:firstLine="1016" w:firstLineChars="677"/>
+        <w:ind w:firstLine="4502" w:firstLineChars="3000"/>
         <w:jc w:val="both"/>
         <w:rPr>
           <w:rFonts w:hint="default"/>
@@ -3027,20 +3064,6 @@
           <w:lang w:val="en-PH"/>
         </w:rPr>
       </w:pPr>
-      <w:r>
-        <w:rPr>
-          <w:rFonts w:hint="default"/>
-          <w:b/>
-          <w:bCs/>
-          <w:i/>
-          <w:iCs/>
-          <w:sz w:val="15"/>
-          <w:szCs w:val="15"/>
-          <w:u w:val="none"/>
-          <w:lang w:val="en-PH"/>
-        </w:rPr>
-        <w:t>Signature Over Printed Name</w:t>
-      </w:r>
     </w:p>
     <w:sectPr>
       <w:pgSz w:w="16838" w:h="11906" w:orient="landscape"/>
@@ -3175,7 +3198,7 @@
     <w:lsdException w:unhideWhenUsed="0" w:uiPriority="0" w:semiHidden="0" w:name="Normal Indent"/>
     <w:lsdException w:unhideWhenUsed="0" w:uiPriority="0" w:semiHidden="0" w:name="footnote text"/>
     <w:lsdException w:unhideWhenUsed="0" w:uiPriority="0" w:semiHidden="0" w:name="annotation text"/>
-    <w:lsdException w:unhideWhenUsed="0" w:uiPriority="0" w:semiHidden="0" w:name="header"/>
+    <w:lsdException w:qFormat="1" w:unhideWhenUsed="0" w:uiPriority="0" w:semiHidden="0" w:name="header"/>
     <w:lsdException w:unhideWhenUsed="0" w:uiPriority="0" w:semiHidden="0" w:name="footer"/>
     <w:lsdException w:unhideWhenUsed="0" w:uiPriority="0" w:semiHidden="0" w:name="index heading"/>
     <w:lsdException w:qFormat="1" w:uiPriority="0" w:name="caption"/>
@@ -3450,6 +3473,7 @@
   <w:style w:type="paragraph" w:styleId="5">
     <w:name w:val="header"/>
     <w:basedOn w:val="1"/>
+    <w:qFormat/>
     <w:uiPriority w:val="0"/>
     <w:pPr>
       <w:tabs>

</xml_diff>

<commit_message>
chore(assets): update SLIP document and remove temporary file
- Update SLIP.docx with formatting adjustments and whitespace corrections
- Remove temporary lock file ~$SLIP.docx created during document editing
- Clean up unnecessary blank lines in document layout
</commit_message>
<xml_diff>
--- a/app/assets/SLIP.docx
+++ b/app/assets/SLIP.docx
@@ -163,12 +163,12 @@
         </w:tblCellMar>
       </w:tblPr>
       <w:tblGrid>
-        <w:gridCol w:w="1824"/>
-        <w:gridCol w:w="943"/>
-        <w:gridCol w:w="943"/>
-        <w:gridCol w:w="1035"/>
-        <w:gridCol w:w="1137"/>
-        <w:gridCol w:w="1097"/>
+        <w:gridCol w:w="1822"/>
+        <w:gridCol w:w="929"/>
+        <w:gridCol w:w="929"/>
+        <w:gridCol w:w="1054"/>
+        <w:gridCol w:w="1147"/>
+        <w:gridCol w:w="1098"/>
       </w:tblGrid>
       <w:tr>
         <w:tblPrEx>
@@ -1560,8 +1560,10 @@
           <w:u w:val="none"/>
           <w:lang w:val="en-PH"/>
         </w:rPr>
-        <w:t>Osas Director/Administrato</w:t>
-      </w:r>
+        <w:t>Osas Directo</w:t>
+      </w:r>
+      <w:bookmarkStart w:id="0" w:name="_GoBack"/>
+      <w:bookmarkEnd w:id="0"/>
       <w:r>
         <w:rPr>
           <w:rFonts w:hint="default"/>
@@ -1570,10 +1572,53 @@
           <w:sz w:val="15"/>
           <w:szCs w:val="15"/>
           <w:u w:val="none"/>
+          <w:lang w:val="en-PH"/>
+        </w:rPr>
+        <w:t>r/Administrato</w:t>
+      </w:r>
+      <w:r>
+        <w:rPr>
+          <w:rFonts w:hint="default"/>
+          <w:b/>
+          <w:bCs/>
+          <w:sz w:val="15"/>
+          <w:szCs w:val="15"/>
+          <w:u w:val="none"/>
           <w:lang w:val="en-US"/>
         </w:rPr>
         <w:t>r</w:t>
       </w:r>
+    </w:p>
+    <w:p>
+      <w:pPr>
+        <w:spacing w:line="240" w:lineRule="auto"/>
+        <w:ind w:firstLine="4427" w:firstLineChars="2950"/>
+        <w:jc w:val="both"/>
+        <w:rPr>
+          <w:rFonts w:hint="default"/>
+          <w:b/>
+          <w:bCs/>
+          <w:sz w:val="15"/>
+          <w:szCs w:val="15"/>
+          <w:u w:val="none"/>
+          <w:lang w:val="en-US"/>
+        </w:rPr>
+      </w:pPr>
+    </w:p>
+    <w:p>
+      <w:pPr>
+        <w:spacing w:line="240" w:lineRule="auto"/>
+        <w:jc w:val="both"/>
+        <w:rPr>
+          <w:rFonts w:hint="default"/>
+          <w:b/>
+          <w:bCs/>
+          <w:sz w:val="15"/>
+          <w:szCs w:val="15"/>
+          <w:u w:val="none"/>
+          <w:lang w:val="en-US"/>
+        </w:rPr>
+      </w:pPr>
     </w:p>
     <w:p>
       <w:pPr>
@@ -1755,12 +1800,12 @@
         </w:tblCellMar>
       </w:tblPr>
       <w:tblGrid>
-        <w:gridCol w:w="1824"/>
-        <w:gridCol w:w="943"/>
-        <w:gridCol w:w="943"/>
-        <w:gridCol w:w="1035"/>
-        <w:gridCol w:w="1137"/>
-        <w:gridCol w:w="1097"/>
+        <w:gridCol w:w="1822"/>
+        <w:gridCol w:w="929"/>
+        <w:gridCol w:w="929"/>
+        <w:gridCol w:w="1054"/>
+        <w:gridCol w:w="1147"/>
+        <w:gridCol w:w="1098"/>
       </w:tblGrid>
       <w:tr>
         <w:tblPrEx>
@@ -2887,17 +2932,6 @@
           <w:szCs w:val="15"/>
         </w:rPr>
       </w:pPr>
-    </w:p>
-    <w:p>
-      <w:pPr>
-        <w:jc w:val="both"/>
-        <w:rPr>
-          <w:sz w:val="15"/>
-          <w:szCs w:val="15"/>
-        </w:rPr>
-      </w:pPr>
-      <w:bookmarkStart w:id="0" w:name="_GoBack"/>
-      <w:bookmarkEnd w:id="0"/>
     </w:p>
     <w:p>
       <w:pPr>
@@ -3199,7 +3233,7 @@
     <w:lsdException w:unhideWhenUsed="0" w:uiPriority="0" w:semiHidden="0" w:name="footnote text"/>
     <w:lsdException w:unhideWhenUsed="0" w:uiPriority="0" w:semiHidden="0" w:name="annotation text"/>
     <w:lsdException w:qFormat="1" w:unhideWhenUsed="0" w:uiPriority="0" w:semiHidden="0" w:name="header"/>
-    <w:lsdException w:unhideWhenUsed="0" w:uiPriority="0" w:semiHidden="0" w:name="footer"/>
+    <w:lsdException w:qFormat="1" w:unhideWhenUsed="0" w:uiPriority="0" w:semiHidden="0" w:name="footer"/>
     <w:lsdException w:unhideWhenUsed="0" w:uiPriority="0" w:semiHidden="0" w:name="index heading"/>
     <w:lsdException w:qFormat="1" w:uiPriority="0" w:name="caption"/>
     <w:lsdException w:unhideWhenUsed="0" w:uiPriority="0" w:semiHidden="0" w:name="table of figures"/>
@@ -3456,6 +3490,7 @@
   <w:style w:type="paragraph" w:styleId="4">
     <w:name w:val="footer"/>
     <w:basedOn w:val="1"/>
+    <w:qFormat/>
     <w:uiPriority w:val="0"/>
     <w:pPr>
       <w:tabs>

</xml_diff>

<commit_message>
style: enhance dark mode styling and fix export formatting
- Add dark mode styles to logout modal with proper contrast and hover states
- Add dark mode styles for announcement list and grid items with hover effects
- Add dark mode styles for announcement view toggle buttons and active states
- Add background color to dark mode table footer in admin announcements
- Add MSO number format styles to export table cells to prevent Excel formatting issues
- Fix SLIP document formatting alignment for consistency
- Improve visual hierarchy and readability in dark mode across announcements and modals
</commit_message>
<xml_diff>
--- a/app/assets/SLIP.docx
+++ b/app/assets/SLIP.docx
@@ -4,7 +4,7 @@
   <w:body>
     <w:p>
       <w:pPr>
-        <w:ind w:firstLine="2475" w:firstLineChars="1650"/>
+        <w:ind w:firstLine="2175" w:firstLineChars="1450"/>
         <w:rPr>
           <w:rFonts w:hint="default" w:ascii="Century Gothic" w:hAnsi="Century Gothic"/>
           <w:sz w:val="15"/>
@@ -1560,21 +1560,7 @@
           <w:u w:val="none"/>
           <w:lang w:val="en-PH"/>
         </w:rPr>
-        <w:t>Osas Directo</w:t>
-      </w:r>
-      <w:bookmarkStart w:id="0" w:name="_GoBack"/>
-      <w:bookmarkEnd w:id="0"/>
-      <w:r>
-        <w:rPr>
-          <w:rFonts w:hint="default"/>
-          <w:b/>
-          <w:bCs/>
-          <w:sz w:val="15"/>
-          <w:szCs w:val="15"/>
-          <w:u w:val="none"/>
-          <w:lang w:val="en-PH"/>
-        </w:rPr>
-        <w:t>r/Administrato</w:t>
+        <w:t>Osas Director/Administrato</w:t>
       </w:r>
       <w:r>
         <w:rPr>
@@ -1698,7 +1684,7 @@
           <w:szCs w:val="15"/>
           <w:lang w:val="en-US"/>
         </w:rPr>
-        <w:t xml:space="preserve">                                                                                                </w:t>
+        <w:t xml:space="preserve">                                                                                 </w:t>
       </w:r>
       <w:r>
         <w:rPr>
@@ -1754,7 +1740,18 @@
           <w:szCs w:val="15"/>
           <w:lang w:val="en-PH"/>
         </w:rPr>
-        <w:t>_________________________</w:t>
+        <w:t>_</w:t>
+      </w:r>
+      <w:bookmarkStart w:id="0" w:name="_GoBack"/>
+      <w:bookmarkEnd w:id="0"/>
+      <w:r>
+        <w:rPr>
+          <w:rFonts w:hint="default" w:ascii="Century Gothic" w:hAnsi="Century Gothic"/>
+          <w:sz w:val="15"/>
+          <w:szCs w:val="15"/>
+          <w:lang w:val="en-PH"/>
+        </w:rPr>
+        <w:t>________________________</w:t>
       </w:r>
       <w:r>
         <w:rPr>

</xml_diff>

<commit_message>
feat(profile): add initials avatar fallback and enhance profile picture handling
- Add initials avatar display as fallback when no profile picture exists
- Generate user initials from session name (first and last name letters)
- Implement dynamic element swapping between span (initials) and img (picture)
- Update profile picture preview with cache-busting timestamp
- Enhance top navigation avatar to display initials or uploaded picture
- Add initials avatar to settings modal profile header
- Update all avatar references across dashboard and user dashboard on profile changes
- Improve profile picture upload handling with proper element replacement
- Add new profile picture asset for user uploads
- Update SLIP document formatting for ID number field
- Refactor CSS styling for settings and navigation components to support avatar display
</commit_message>
<xml_diff>
--- a/app/assets/SLIP.docx
+++ b/app/assets/SLIP.docx
@@ -1740,19 +1740,10 @@
           <w:szCs w:val="15"/>
           <w:lang w:val="en-PH"/>
         </w:rPr>
-        <w:t>_</w:t>
+        <w:t>_______________</w:t>
       </w:r>
       <w:bookmarkStart w:id="0" w:name="_GoBack"/>
       <w:bookmarkEnd w:id="0"/>
-      <w:r>
-        <w:rPr>
-          <w:rFonts w:hint="default" w:ascii="Century Gothic" w:hAnsi="Century Gothic"/>
-          <w:sz w:val="15"/>
-          <w:szCs w:val="15"/>
-          <w:lang w:val="en-PH"/>
-        </w:rPr>
-        <w:t>________________________</w:t>
-      </w:r>
       <w:r>
         <w:rPr>
           <w:rFonts w:ascii="Century Gothic" w:hAnsi="Century Gothic"/>

</xml_diff>

<commit_message>
chore(assets): remove permission validity section from SLIP document template
- Remove "Permission Validity" header and associated policy text from both SLIP instances
- Delete lines specifying monthly permission limits and violation consequences
- Clean up trailing whitespace and formatting inconsistencies
- Simplify document by removing outdated permission validity guidelines
</commit_message>
<xml_diff>
--- a/app/assets/SLIP.docx
+++ b/app/assets/SLIP.docx
@@ -1,6 +1,6 @@
 
 <file path=word/document.xml><?xml version="1.0" encoding="utf-8"?>
-<w:document xmlns:wpc="http://schemas.microsoft.com/office/word/2010/wordprocessingCanvas" xmlns:mc="http://schemas.openxmlformats.org/markup-compatibility/2006" xmlns:o="urn:schemas-microsoft-com:office:office" xmlns:r="http://schemas.openxmlformats.org/officeDocument/2006/relationships" xmlns:m="http://schemas.openxmlformats.org/officeDocument/2006/math" xmlns:v="urn:schemas-microsoft-com:vml" xmlns:wp14="http://schemas.microsoft.com/office/word/2010/wordprocessingDrawing" xmlns:wp="http://schemas.openxmlformats.org/drawingml/2006/wordprocessingDrawing" xmlns:w="http://schemas.openxmlformats.org/wordprocessingml/2006/main" xmlns:w14="http://schemas.microsoft.com/office/word/2010/wordml" xmlns:w10="urn:schemas-microsoft-com:office:word" xmlns:w15="http://schemas.microsoft.com/office/word/2012/wordml" xmlns:wpg="http://schemas.microsoft.com/office/word/2010/wordprocessingGroup" xmlns:wpi="http://schemas.microsoft.com/office/word/2010/wordprocessingInk" xmlns:wne="http://schemas.microsoft.com/office/word/2006/wordml" xmlns:wps="http://schemas.microsoft.com/office/word/2010/wordprocessingShape" xmlns:wpsCustomData="http://www.wps.cn/officeDocument/2013/wpsCustomData" mc:Ignorable="w14 w15 wp14">
+<w:document xmlns:wpc="http://schemas.microsoft.com/office/word/2010/wordprocessingCanvas" xmlns:cx="http://schemas.microsoft.com/office/drawing/2014/chartex" xmlns:cx1="http://schemas.microsoft.com/office/drawing/2015/9/8/chartex" xmlns:cx2="http://schemas.microsoft.com/office/drawing/2015/10/21/chartex" xmlns:cx3="http://schemas.microsoft.com/office/drawing/2016/5/9/chartex" xmlns:cx4="http://schemas.microsoft.com/office/drawing/2016/5/10/chartex" xmlns:cx5="http://schemas.microsoft.com/office/drawing/2016/5/11/chartex" xmlns:cx6="http://schemas.microsoft.com/office/drawing/2016/5/12/chartex" xmlns:cx7="http://schemas.microsoft.com/office/drawing/2016/5/13/chartex" xmlns:cx8="http://schemas.microsoft.com/office/drawing/2016/5/14/chartex" xmlns:mc="http://schemas.openxmlformats.org/markup-compatibility/2006" xmlns:o="urn:schemas-microsoft-com:office:office" xmlns:r="http://schemas.openxmlformats.org/officeDocument/2006/relationships" xmlns:m="http://schemas.openxmlformats.org/officeDocument/2006/math" xmlns:v="urn:schemas-microsoft-com:vml" xmlns:wp14="http://schemas.microsoft.com/office/word/2010/wordprocessingDrawing" xmlns:wp="http://schemas.openxmlformats.org/drawingml/2006/wordprocessingDrawing" xmlns:w="http://schemas.openxmlformats.org/wordprocessingml/2006/main" xmlns:w14="http://schemas.microsoft.com/office/word/2010/wordml" xmlns:w10="urn:schemas-microsoft-com:office:word" xmlns:w15="http://schemas.microsoft.com/office/word/2012/wordml" xmlns:wpg="http://schemas.microsoft.com/office/word/2010/wordprocessingGroup" xmlns:wpi="http://schemas.microsoft.com/office/word/2010/wordprocessingInk" xmlns:wne="http://schemas.microsoft.com/office/word/2006/wordml" xmlns:wps="http://schemas.microsoft.com/office/word/2010/wordprocessingShape" xmlns:wpsCustomData="http://www.wps.cn/officeDocument/2013/wpsCustomData" mc:Ignorable="w14 w15 wp14">
   <w:body>
     <w:p>
       <w:pPr>
@@ -163,12 +163,12 @@
         </w:tblCellMar>
       </w:tblPr>
       <w:tblGrid>
-        <w:gridCol w:w="1822"/>
-        <w:gridCol w:w="929"/>
-        <w:gridCol w:w="929"/>
-        <w:gridCol w:w="1054"/>
-        <w:gridCol w:w="1147"/>
-        <w:gridCol w:w="1098"/>
+        <w:gridCol w:w="1824"/>
+        <w:gridCol w:w="943"/>
+        <w:gridCol w:w="943"/>
+        <w:gridCol w:w="1035"/>
+        <w:gridCol w:w="1137"/>
+        <w:gridCol w:w="1097"/>
       </w:tblGrid>
       <w:tr>
         <w:tblPrEx>
@@ -1190,110 +1190,17 @@
     <w:p>
       <w:pPr>
         <w:pStyle w:val="6"/>
-        <w:rPr>
-          <w:rFonts w:cstheme="minorHAnsi"/>
-          <w:b/>
-          <w:bCs/>
-          <w:sz w:val="15"/>
-          <w:szCs w:val="15"/>
-        </w:rPr>
-      </w:pPr>
-      <w:r>
-        <w:rPr>
-          <w:rFonts w:cstheme="minorHAnsi"/>
-          <w:b/>
-          <w:bCs/>
-          <w:sz w:val="15"/>
-          <w:szCs w:val="15"/>
-        </w:rPr>
-        <w:t>Permission Validity:</w:t>
-      </w:r>
-    </w:p>
-    <w:p>
-      <w:pPr>
-        <w:pStyle w:val="6"/>
         <w:numPr>
           <w:ilvl w:val="0"/>
-          <w:numId w:val="1"/>
+          <w:numId w:val="0"/>
         </w:numPr>
-        <w:ind w:left="420" w:leftChars="0" w:hanging="420" w:firstLineChars="0"/>
+        <w:ind w:leftChars="0"/>
         <w:rPr>
           <w:rFonts w:cstheme="minorHAnsi"/>
           <w:sz w:val="15"/>
           <w:szCs w:val="15"/>
         </w:rPr>
       </w:pPr>
-      <w:r>
-        <w:rPr>
-          <w:rFonts w:cstheme="minorHAnsi"/>
-          <w:sz w:val="15"/>
-          <w:szCs w:val="15"/>
-        </w:rPr>
-        <w:t>Allowed until 2 permissions per month for the listed violation(s).</w:t>
-      </w:r>
-    </w:p>
-    <w:p>
-      <w:pPr>
-        <w:pStyle w:val="6"/>
-        <w:numPr>
-          <w:ilvl w:val="0"/>
-          <w:numId w:val="1"/>
-        </w:numPr>
-        <w:ind w:left="420" w:leftChars="0" w:hanging="420" w:firstLineChars="0"/>
-        <w:rPr>
-          <w:rFonts w:cstheme="minorHAnsi"/>
-          <w:sz w:val="15"/>
-          <w:szCs w:val="15"/>
-        </w:rPr>
-      </w:pPr>
-      <w:r>
-        <w:rPr>
-          <w:rFonts w:cstheme="minorHAnsi"/>
-          <w:sz w:val="15"/>
-          <w:szCs w:val="15"/>
-        </w:rPr>
-        <w:t>Allowed if there is a valid reason.</w:t>
-      </w:r>
-    </w:p>
-    <w:p>
-      <w:pPr>
-        <w:pStyle w:val="6"/>
-        <w:numPr>
-          <w:ilvl w:val="0"/>
-          <w:numId w:val="1"/>
-        </w:numPr>
-        <w:ind w:left="420" w:leftChars="0" w:hanging="420" w:firstLineChars="0"/>
-        <w:rPr>
-          <w:rFonts w:cstheme="minorHAnsi"/>
-          <w:sz w:val="15"/>
-          <w:szCs w:val="15"/>
-        </w:rPr>
-      </w:pPr>
-      <w:r>
-        <w:rPr>
-          <w:rFonts w:cstheme="minorHAnsi"/>
-          <w:sz w:val="15"/>
-          <w:szCs w:val="15"/>
-        </w:rPr>
-        <w:t>Further</w:t>
-      </w:r>
-      <w:r>
-        <w:rPr>
-          <w:rFonts w:hint="default" w:cstheme="minorHAnsi"/>
-          <w:sz w:val="15"/>
-          <w:szCs w:val="15"/>
-          <w:lang w:val="en-US"/>
-        </w:rPr>
-        <w:t xml:space="preserve"> </w:t>
-      </w:r>
-      <w:r>
-        <w:rPr>
-          <w:rFonts w:cstheme="minorHAnsi"/>
-          <w:sz w:val="15"/>
-          <w:szCs w:val="15"/>
-        </w:rPr>
-        <w:t>violations beyond this limit will result in appropriate disciplinary actions.</w:t>
-      </w:r>
     </w:p>
     <w:p>
       <w:pPr>
@@ -1303,6 +1210,41 @@
           <w:numId w:val="0"/>
         </w:numPr>
         <w:ind w:leftChars="0"/>
+        <w:rPr>
+          <w:rFonts w:cstheme="minorHAnsi"/>
+          <w:sz w:val="15"/>
+          <w:szCs w:val="15"/>
+        </w:rPr>
+      </w:pPr>
+      <w:bookmarkStart w:id="0" w:name="_GoBack"/>
+      <w:bookmarkEnd w:id="0"/>
+    </w:p>
+    <w:p>
+      <w:pPr>
+        <w:pStyle w:val="6"/>
+        <w:numPr>
+          <w:ilvl w:val="0"/>
+          <w:numId w:val="0"/>
+        </w:numPr>
+        <w:ind w:leftChars="0"/>
+        <w:rPr>
+          <w:rFonts w:cstheme="minorHAnsi"/>
+          <w:sz w:val="15"/>
+          <w:szCs w:val="15"/>
+        </w:rPr>
+      </w:pPr>
+    </w:p>
+    <w:p>
+      <w:pPr>
+        <w:pStyle w:val="6"/>
+        <w:numPr>
+          <w:ilvl w:val="0"/>
+          <w:numId w:val="0"/>
+        </w:numPr>
+        <w:tabs>
+          <w:tab w:val="left" w:pos="420"/>
+        </w:tabs>
+        <w:spacing w:after="0" w:line="240" w:lineRule="auto"/>
         <w:rPr>
           <w:rFonts w:cstheme="minorHAnsi"/>
           <w:sz w:val="15"/>
@@ -1578,22 +1520,6 @@
     <w:p>
       <w:pPr>
         <w:spacing w:line="240" w:lineRule="auto"/>
-        <w:ind w:firstLine="4427" w:firstLineChars="2950"/>
-        <w:jc w:val="both"/>
-        <w:rPr>
-          <w:rFonts w:hint="default"/>
-          <w:b/>
-          <w:bCs/>
-          <w:sz w:val="15"/>
-          <w:szCs w:val="15"/>
-          <w:u w:val="none"/>
-          <w:lang w:val="en-US"/>
-        </w:rPr>
-      </w:pPr>
-    </w:p>
-    <w:p>
-      <w:pPr>
-        <w:spacing w:line="240" w:lineRule="auto"/>
         <w:jc w:val="both"/>
         <w:rPr>
           <w:rFonts w:hint="default"/>
@@ -1742,8 +1668,6 @@
         </w:rPr>
         <w:t>_______________</w:t>
       </w:r>
-      <w:bookmarkStart w:id="0" w:name="_GoBack"/>
-      <w:bookmarkEnd w:id="0"/>
       <w:r>
         <w:rPr>
           <w:rFonts w:ascii="Century Gothic" w:hAnsi="Century Gothic"/>
@@ -1788,12 +1712,12 @@
         </w:tblCellMar>
       </w:tblPr>
       <w:tblGrid>
-        <w:gridCol w:w="1822"/>
-        <w:gridCol w:w="929"/>
-        <w:gridCol w:w="929"/>
-        <w:gridCol w:w="1054"/>
-        <w:gridCol w:w="1147"/>
-        <w:gridCol w:w="1098"/>
+        <w:gridCol w:w="1824"/>
+        <w:gridCol w:w="943"/>
+        <w:gridCol w:w="943"/>
+        <w:gridCol w:w="1035"/>
+        <w:gridCol w:w="1137"/>
+        <w:gridCol w:w="1097"/>
       </w:tblGrid>
       <w:tr>
         <w:tblPrEx>
@@ -2815,93 +2739,21 @@
     </w:p>
     <w:p>
       <w:pPr>
-        <w:pStyle w:val="6"/>
-        <w:rPr>
-          <w:rFonts w:cstheme="minorHAnsi"/>
-          <w:b/>
-          <w:bCs/>
-          <w:sz w:val="15"/>
-          <w:szCs w:val="15"/>
-        </w:rPr>
-      </w:pPr>
-      <w:r>
-        <w:rPr>
-          <w:rFonts w:cstheme="minorHAnsi"/>
-          <w:b/>
-          <w:bCs/>
-          <w:sz w:val="15"/>
-          <w:szCs w:val="15"/>
-        </w:rPr>
-        <w:t>Permission Validity:</w:t>
-      </w:r>
-    </w:p>
-    <w:p>
-      <w:pPr>
-        <w:pStyle w:val="6"/>
-        <w:numPr>
-          <w:ilvl w:val="0"/>
-          <w:numId w:val="1"/>
-        </w:numPr>
-        <w:ind w:left="420" w:leftChars="0" w:hanging="420" w:firstLineChars="0"/>
-        <w:rPr>
-          <w:rFonts w:cstheme="minorHAnsi"/>
-          <w:sz w:val="15"/>
-          <w:szCs w:val="15"/>
-        </w:rPr>
-      </w:pPr>
-      <w:r>
-        <w:rPr>
-          <w:rFonts w:cstheme="minorHAnsi"/>
-          <w:sz w:val="15"/>
-          <w:szCs w:val="15"/>
-        </w:rPr>
-        <w:t>Allowed until 2 permissions per month for the listed violation(s).</w:t>
-      </w:r>
-    </w:p>
-    <w:p>
-      <w:pPr>
-        <w:pStyle w:val="6"/>
-        <w:numPr>
-          <w:ilvl w:val="0"/>
-          <w:numId w:val="1"/>
-        </w:numPr>
-        <w:ind w:left="420" w:leftChars="0" w:hanging="420" w:firstLineChars="0"/>
-        <w:rPr>
-          <w:rFonts w:cstheme="minorHAnsi"/>
-          <w:sz w:val="15"/>
-          <w:szCs w:val="15"/>
-        </w:rPr>
-      </w:pPr>
-      <w:r>
-        <w:rPr>
-          <w:rFonts w:cstheme="minorHAnsi"/>
-          <w:sz w:val="15"/>
-          <w:szCs w:val="15"/>
-        </w:rPr>
-        <w:t>Allowed if there is a valid reason.</w:t>
-      </w:r>
-    </w:p>
-    <w:p>
-      <w:pPr>
-        <w:pStyle w:val="6"/>
-        <w:numPr>
-          <w:ilvl w:val="0"/>
-          <w:numId w:val="1"/>
-        </w:numPr>
-        <w:ind w:left="420" w:leftChars="0" w:hanging="420" w:firstLineChars="0"/>
-        <w:rPr>
-          <w:sz w:val="15"/>
-          <w:szCs w:val="15"/>
-        </w:rPr>
-      </w:pPr>
-      <w:r>
-        <w:rPr>
-          <w:rFonts w:cstheme="minorHAnsi"/>
-          <w:sz w:val="15"/>
-          <w:szCs w:val="15"/>
-        </w:rPr>
-        <w:t>Further violations beyond this limit will result in appropriate disciplinary actions</w:t>
-      </w:r>
+        <w:jc w:val="both"/>
+        <w:rPr>
+          <w:sz w:val="15"/>
+          <w:szCs w:val="15"/>
+        </w:rPr>
+      </w:pPr>
+    </w:p>
+    <w:p>
+      <w:pPr>
+        <w:jc w:val="both"/>
+        <w:rPr>
+          <w:sz w:val="15"/>
+          <w:szCs w:val="15"/>
+        </w:rPr>
+      </w:pPr>
     </w:p>
     <w:p>
       <w:pPr>
@@ -3148,34 +3000,6 @@
     </w:p>
   </w:footnote>
 </w:footnotes>
-</file>
-
-<file path=word/numbering.xml><?xml version="1.0" encoding="utf-8"?>
-<w:numbering xmlns:wpc="http://schemas.microsoft.com/office/word/2010/wordprocessingCanvas" xmlns:mc="http://schemas.openxmlformats.org/markup-compatibility/2006" xmlns:o="urn:schemas-microsoft-com:office:office" xmlns:r="http://schemas.openxmlformats.org/officeDocument/2006/relationships" xmlns:m="http://schemas.openxmlformats.org/officeDocument/2006/math" xmlns:v="urn:schemas-microsoft-com:vml" xmlns:wp14="http://schemas.microsoft.com/office/word/2010/wordprocessingDrawing" xmlns:wp="http://schemas.openxmlformats.org/drawingml/2006/wordprocessingDrawing" xmlns:w10="urn:schemas-microsoft-com:office:word" xmlns:w="http://schemas.openxmlformats.org/wordprocessingml/2006/main" xmlns:w14="http://schemas.microsoft.com/office/word/2010/wordml" xmlns:wpg="http://schemas.microsoft.com/office/word/2010/wordprocessingGroup" xmlns:wpi="http://schemas.microsoft.com/office/word/2010/wordprocessingInk" xmlns:wne="http://schemas.microsoft.com/office/word/2006/wordml" xmlns:wps="http://schemas.microsoft.com/office/word/2010/wordprocessingShape" xmlns:wpsCustomData="http://www.wps.cn/officeDocument/2013/wpsCustomData" mc:Ignorable="w14 wp14">
-  <w:abstractNum w:abstractNumId="0">
-    <w:nsid w:val="ED25FC55"/>
-    <w:multiLevelType w:val="singleLevel"/>
-    <w:tmpl w:val="ED25FC55"/>
-    <w:lvl w:ilvl="0" w:tentative="0">
-      <w:start w:val="1"/>
-      <w:numFmt w:val="bullet"/>
-      <w:lvlText w:val=""/>
-      <w:lvlJc w:val="left"/>
-      <w:pPr>
-        <w:tabs>
-          <w:tab w:val="left" w:pos="420"/>
-        </w:tabs>
-        <w:ind w:left="420" w:leftChars="0" w:hanging="420" w:firstLineChars="0"/>
-      </w:pPr>
-      <w:rPr>
-        <w:rFonts w:hint="default" w:ascii="Wingdings" w:hAnsi="Wingdings"/>
-      </w:rPr>
-    </w:lvl>
-  </w:abstractNum>
-  <w:num w:numId="1">
-    <w:abstractNumId w:val="0"/>
-  </w:num>
-</w:numbering>
 </file>
 
 <file path=word/styles.xml><?xml version="1.0" encoding="utf-8"?>

</xml_diff>

<commit_message>
chore(assets): add spacing to SLIP document template
- Add blank line after administrator signature section in SLIP.docx
- Improve visual spacing between signature block and entrance slip header
- Enhance document readability and formatting consistency
</commit_message>
<xml_diff>
--- a/app/assets/SLIP.docx
+++ b/app/assets/SLIP.docx
@@ -1216,8 +1216,6 @@
           <w:szCs w:val="15"/>
         </w:rPr>
       </w:pPr>
-      <w:bookmarkStart w:id="0" w:name="_GoBack"/>
-      <w:bookmarkEnd w:id="0"/>
     </w:p>
     <w:p>
       <w:pPr>
@@ -1531,6 +1529,23 @@
           <w:lang w:val="en-US"/>
         </w:rPr>
       </w:pPr>
+    </w:p>
+    <w:p>
+      <w:pPr>
+        <w:spacing w:line="240" w:lineRule="auto"/>
+        <w:jc w:val="both"/>
+        <w:rPr>
+          <w:rFonts w:hint="default"/>
+          <w:b/>
+          <w:bCs/>
+          <w:sz w:val="15"/>
+          <w:szCs w:val="15"/>
+          <w:u w:val="none"/>
+          <w:lang w:val="en-US"/>
+        </w:rPr>
+      </w:pPr>
+      <w:bookmarkStart w:id="0" w:name="_GoBack"/>
+      <w:bookmarkEnd w:id="0"/>
     </w:p>
     <w:p>
       <w:pPr>

</xml_diff>